<commit_message>
Add GitHub URL and author name; remove blank template
</commit_message>
<xml_diff>
--- a/1.5-Guided-Practice/LabReport_GuidedPractice_BuildaPage.docx
+++ b/1.5-Guided-Practice/LabReport_GuidedPractice_BuildaPage.docx
@@ -43,8 +43,16 @@
       <w:r>
         <w:t xml:space="preserve">GitHub Repository: </w:t>
       </w:r>
+      <w:hyperlink r:id="rId10" w:history="1">
+        <w:r>
+          <w:rPr>
+            <w:rStyle w:val="Hyperlink"/>
+          </w:rPr>
+          <w:t>https://github.com/darhym6254/SDC260-Web-Dev-Class/tree/main/1.5-Guided-Practice</w:t>
+        </w:r>
+      </w:hyperlink>
       <w:r>
-        <w:t>https://github.com/darhym6254/1.5-Guided-Practice</w:t>
+        <w:t xml:space="preserve"> </w:t>
       </w:r>
     </w:p>
     <w:p>
@@ -391,7 +399,7 @@
                     <pic:cNvPicPr/>
                   </pic:nvPicPr>
                   <pic:blipFill>
-                    <a:blip r:embed="rId10"/>
+                    <a:blip r:embed="rId11"/>
                     <a:stretch>
                       <a:fillRect/>
                     </a:stretch>
@@ -440,7 +448,7 @@
                     <pic:cNvPicPr/>
                   </pic:nvPicPr>
                   <pic:blipFill>
-                    <a:blip r:embed="rId11"/>
+                    <a:blip r:embed="rId12"/>
                     <a:stretch>
                       <a:fillRect/>
                     </a:stretch>
@@ -495,7 +503,7 @@
                     <pic:cNvPicPr/>
                   </pic:nvPicPr>
                   <pic:blipFill>
-                    <a:blip r:embed="rId12"/>
+                    <a:blip r:embed="rId13"/>
                     <a:stretch>
                       <a:fillRect/>
                     </a:stretch>
@@ -546,8 +554,8 @@
     </w:p>
     <w:p/>
     <w:sectPr>
-      <w:headerReference w:type="default" r:id="rId13"/>
-      <w:footerReference w:type="default" r:id="rId14"/>
+      <w:headerReference w:type="default" r:id="rId14"/>
+      <w:footerReference w:type="default" r:id="rId15"/>
       <w:pgSz w:w="12240" w:h="15840" w:code="1"/>
       <w:pgMar w:top="1440" w:right="1440" w:bottom="1440" w:left="1440" w:header="1440" w:footer="1440" w:gutter="144"/>
       <w:cols w:space="720"/>

</xml_diff>